<commit_message>
Sereth pronouns they/them → she/her, .gitignore updates, Part I/II rebuilds
- 03_CHARACTER_BIBLE: Sereth section updated to she/her throughout
- 05_OUTLINE_PART_1: Ch5 Sereth section updated to she/her
- .gitignore: added *.enex, .venv/
- Rebuilt Part I EPUB, Part I DOCX, Part II DOCX
</commit_message>
<xml_diff>
--- a/Part I - The Still Water.docx
+++ b/Part I - The Still Water.docx
@@ -6507,31 +6507,43 @@
           <w:rFonts w:ascii="Georgia" w:hAnsi="Georgia"/>
           <w:sz w:val="24"/>
         </w:rPr>
-        <w:t>Sereth had been dying for three hundred years and was beginning to suspect they weren't very good at it.</w:t>
-      </w:r>
-    </w:p>
-    <w:p>
-      <w:pPr>
-        <w:ind w:firstLine="720"/>
-      </w:pPr>
-      <w:r>
-        <w:rPr>
-          <w:rFonts w:ascii="Georgia" w:hAnsi="Georgia"/>
-          <w:sz w:val="24"/>
-        </w:rPr>
-        <w:t>The symptoms were there — had been there for decades, accumulating with the patient thoroughness of rust on iron. The joints ached. The eyes, which had once seen the individual threads of light that composed a sunrise, now saw only the sunrise, which was still beautiful but in the diminished way that a painting of a fire is beautiful compared to the fire itself. The skin bruised easily. The teeth — they had lost two in the last century, which was two more than they had lost in the previous ten thousand years, and the absence of them was a small, persistent humiliation, like a god discovering they are capable of tripping.</w:t>
-      </w:r>
-    </w:p>
-    <w:p>
-      <w:pPr>
-        <w:ind w:firstLine="720"/>
-      </w:pPr>
-      <w:r>
-        <w:rPr>
-          <w:rFonts w:ascii="Georgia" w:hAnsi="Georgia"/>
-          <w:sz w:val="24"/>
-        </w:rPr>
-        <w:t xml:space="preserve">They were dying. The other six had promised them this — </w:t>
+        <w:t>Sereth had been dying for three hundred years and was beginning to suspect she wasn't very good at it.</w:t>
+      </w:r>
+    </w:p>
+    <w:p>
+      <w:pPr>
+        <w:ind w:firstLine="720"/>
+      </w:pPr>
+      <w:r>
+        <w:rPr>
+          <w:rFonts w:ascii="Georgia" w:hAnsi="Georgia"/>
+          <w:sz w:val="24"/>
+        </w:rPr>
+        <w:t>She was not female the way mortals were female. She was not anything the way mortals were anything. But she had chosen the shape, and the shape had chosen the word, and three centuries of wearing it had made it true enough.</w:t>
+      </w:r>
+    </w:p>
+    <w:p>
+      <w:pPr>
+        <w:ind w:firstLine="720"/>
+      </w:pPr>
+      <w:r>
+        <w:rPr>
+          <w:rFonts w:ascii="Georgia" w:hAnsi="Georgia"/>
+          <w:sz w:val="24"/>
+        </w:rPr>
+        <w:t>The symptoms were there — had been there for decades, accumulating with the patient thoroughness of rust on iron. The joints ached. The eyes, which had once seen the individual threads of light that composed a sunrise, now saw only the sunrise, which was still beautiful but in the diminished way that a painting of a fire is beautiful compared to the fire itself. The skin bruised easily. The teeth — she had lost two in the last century, which was two more than she had lost in the previous ten thousand years, and the absence of them was a small, persistent humiliation, like a god discovering she is capable of tripping.</w:t>
+      </w:r>
+    </w:p>
+    <w:p>
+      <w:pPr>
+        <w:ind w:firstLine="720"/>
+      </w:pPr>
+      <w:r>
+        <w:rPr>
+          <w:rFonts w:ascii="Georgia" w:hAnsi="Georgia"/>
+          <w:sz w:val="24"/>
+        </w:rPr>
+        <w:t xml:space="preserve">She was dying. The other six had promised her this — </w:t>
       </w:r>
       <w:r>
         <w:rPr>
@@ -6558,7 +6570,7 @@
           <w:rFonts w:ascii="Georgia" w:hAnsi="Georgia"/>
           <w:sz w:val="24"/>
         </w:rPr>
-        <w:t>They sat on a rock at the edge of a trade road, forty miles south of a village too small to have a name, and they were peeling an apple with a knife that was older than most civilizations, and they were pretending to be a merchant, which was the role they had worn most often in this century because merchants could go anywhere and talk to anyone and no one questioned why they knew too much about too many things.</w:t>
+        <w:t>She sat on a rock at the edge of a trade road, forty miles south of a village too small to have a name, and she was peeling an apple with a knife that was older than most civilizations, and she was pretending to be a merchant, which was the role she had worn most often in this century because merchants could go anywhere and talk to anyone and no one questioned why they knew too much about too many things.</w:t>
       </w:r>
     </w:p>
     <w:p>
@@ -6627,7 +6639,7 @@
           <w:rFonts w:ascii="Georgia" w:hAnsi="Georgia"/>
           <w:sz w:val="24"/>
         </w:rPr>
-        <w:t xml:space="preserve">The other six had done more than punish Sereth. They had punished the gift. Subtly — not with fire or flood, not with the dramatic interventions that the stories attributed to them. With whispers. With small corruptions planted in the world's memory like seeds in fertile soil: the suggestion that more magic meant more safety, that safety required control, that control justified taking. The six had not created the draining. They had created the </w:t>
+        <w:t xml:space="preserve">The other six had done more than punish Sereth. They had punished her gift. Subtly — not with fire or flood, not with the dramatic interventions that the stories attributed to them. With whispers. With small corruptions planted in the world's memory like seeds in fertile soil: the suggestion that more magic meant more safety, that safety required control, that control justified taking. The six had not created the draining. They had created the </w:t>
       </w:r>
       <w:r>
         <w:rPr>
@@ -6654,7 +6666,7 @@
           <w:rFonts w:ascii="Georgia" w:hAnsi="Georgia"/>
           <w:sz w:val="24"/>
         </w:rPr>
-        <w:t>They bit into the apple. They closed their eyes. The juice was sharp and cold and ran down their chin and they did not wipe it because three hundred years of mortality had taught them that small pleasures should not be interrupted by small dignities.</w:t>
+        <w:t>She bit into the apple. She closed her eyes. The juice was sharp and cold and ran down her chin and she did not wipe it because three hundred years of mortality had taught her that small pleasures should not be interrupted by small dignities.</w:t>
       </w:r>
     </w:p>
     <w:p>
@@ -6746,7 +6758,7 @@
           <w:rFonts w:ascii="Georgia" w:hAnsi="Georgia"/>
           <w:sz w:val="24"/>
         </w:rPr>
-        <w:t xml:space="preserve">Their hands were shaking. Not the arthritic tremor that had become their companion in the last fifty years — a different shaking. Cellular. Fundamental. The vibration of a tuning fork struck by a frequency it was designed to match. Their body — this aging, mortal, beautifully crude body — was </w:t>
+        <w:t xml:space="preserve">Her hands were shaking. Not the arthritic tremor that had become her companion in the last fifty years — a different shaking. Cellular. Fundamental. The vibration of a tuning fork struck by a frequency it was designed to match. Her body — this aging, mortal, beautifully crude body — was </w:t>
       </w:r>
       <w:r>
         <w:rPr>
@@ -6773,7 +6785,7 @@
           <w:rFonts w:ascii="Georgia" w:hAnsi="Georgia"/>
           <w:sz w:val="24"/>
         </w:rPr>
-        <w:t>They knew the sound. They had heard it once before, three hundred years ago, standing in a field of wildflowers while a kind man poured himself into a pillar of crystal and dissolved into the world's memory. That sound. Fletcher's sound. The Sing — all seven disciplines in a single voice, every memory at once, the world's entire song compressed into one human throat.</w:t>
+        <w:t>She knew the sound. She had heard it once before, three hundred years ago, standing in a field of wildflowers while a kind man poured himself into a pillar of crystal and dissolved into the world's memory. That sound. Fletcher's sound. The Sing — all seven disciplines in a single voice, every memory at once, the world's entire song compressed into one human throat.</w:t>
       </w:r>
     </w:p>
     <w:p>
@@ -6810,7 +6822,7 @@
           <w:rFonts w:ascii="Georgia" w:hAnsi="Georgia"/>
           <w:sz w:val="24"/>
         </w:rPr>
-        <w:t>The note lasted three seconds. Sereth counted them — an old habit, counting seconds, because gods who become mortal learn very quickly that time, which had once been a landscape they moved through at will, is now a river that carries them whether they consent or not, and counting is the only way to prove you're still paying attention.</w:t>
+        <w:t>The note lasted three seconds. Sereth counted them — an old habit, counting seconds, because gods who become mortal learn very quickly that time, which had once been a landscape she moved through at will, is now a river that carries her whether she consents or not, and counting is the only way to prove she's still paying attention.</w:t>
       </w:r>
     </w:p>
     <w:p>
@@ -6834,31 +6846,31 @@
           <w:rFonts w:ascii="Georgia" w:hAnsi="Georgia"/>
           <w:sz w:val="24"/>
         </w:rPr>
-        <w:t>Sereth stood. The apple lay in the dirt, one bite missing, already browning. They left it. They had been leaving things behind for three hundred years — possessions, identities, the faces of people they had loved — and the apple was the smallest loss in a long catalog, but they noticed it anyway, because mortality had made them sentimental and sentimentality had made them precise about the things they discarded.</w:t>
-      </w:r>
-    </w:p>
-    <w:p>
-      <w:pPr>
-        <w:ind w:firstLine="720"/>
-      </w:pPr>
-      <w:r>
-        <w:rPr>
-          <w:rFonts w:ascii="Georgia" w:hAnsi="Georgia"/>
-          <w:sz w:val="24"/>
-        </w:rPr>
-        <w:t>They closed their eyes and changed.</w:t>
-      </w:r>
-    </w:p>
-    <w:p>
-      <w:pPr>
-        <w:ind w:firstLine="720"/>
-      </w:pPr>
-      <w:r>
-        <w:rPr>
-          <w:rFonts w:ascii="Georgia" w:hAnsi="Georgia"/>
-          <w:sz w:val="24"/>
-        </w:rPr>
-        <w:t xml:space="preserve">It was not magic — not exactly. It was closer to remembering. The body they wore was a memory: </w:t>
+        <w:t>Sereth stood. The apple lay in the dirt, one bite missing, already browning. She left it. She had been leaving things behind for three hundred years — possessions, identities, the faces of people she had loved — and the apple was the smallest loss in a long catalog, but she noticed it anyway, because mortality had made her sentimental and sentimentality had made her precise about the things she discarded.</w:t>
+      </w:r>
+    </w:p>
+    <w:p>
+      <w:pPr>
+        <w:ind w:firstLine="720"/>
+      </w:pPr>
+      <w:r>
+        <w:rPr>
+          <w:rFonts w:ascii="Georgia" w:hAnsi="Georgia"/>
+          <w:sz w:val="24"/>
+        </w:rPr>
+        <w:t>She closed her eyes and changed.</w:t>
+      </w:r>
+    </w:p>
+    <w:p>
+      <w:pPr>
+        <w:ind w:firstLine="720"/>
+      </w:pPr>
+      <w:r>
+        <w:rPr>
+          <w:rFonts w:ascii="Georgia" w:hAnsi="Georgia"/>
+          <w:sz w:val="24"/>
+        </w:rPr>
+        <w:t xml:space="preserve">It was not magic — not exactly. It was closer to remembering. The body she wore was a memory: </w:t>
       </w:r>
       <w:r>
         <w:rPr>
@@ -6873,19 +6885,19 @@
           <w:rFonts w:ascii="Georgia" w:hAnsi="Georgia"/>
           <w:sz w:val="24"/>
         </w:rPr>
-        <w:t>. To change it, they simply remembered a different one. The merchant — male, middle-aged, weathered — dissolved, and in his place: an older woman. Canopy-born, by the look of her — broad-shouldered, sun-darkened, with the calloused hands of someone who had spent decades working wood. Grey hair pulled back. Lines around the eyes that suggested a life of squinting into forest light. Unremarkable. Forgettable. Safe.</w:t>
-      </w:r>
-    </w:p>
-    <w:p>
-      <w:pPr>
-        <w:ind w:firstLine="720"/>
-      </w:pPr>
-      <w:r>
-        <w:rPr>
-          <w:rFonts w:ascii="Georgia" w:hAnsi="Georgia"/>
-          <w:sz w:val="24"/>
-        </w:rPr>
-        <w:t>They picked up the merchant's pack — the same pack, regardless of the body carrying it — and started north.</w:t>
+        <w:t>. To change it, she simply remembered a different one. The merchant — male, middle-aged, weathered — dissolved, and in his place: an older woman. Canopy-born, by the look of her — broad-shouldered, sun-darkened, with the calloused hands of someone who had spent decades working wood. Grey hair pulled back. Lines around the eyes that suggested a life of squinting into forest light. Unremarkable. Forgettable. Safe.</w:t>
+      </w:r>
+    </w:p>
+    <w:p>
+      <w:pPr>
+        <w:ind w:firstLine="720"/>
+      </w:pPr>
+      <w:r>
+        <w:rPr>
+          <w:rFonts w:ascii="Georgia" w:hAnsi="Georgia"/>
+          <w:sz w:val="24"/>
+        </w:rPr>
+        <w:t>She picked up the merchant's pack — the same pack, regardless of the body carrying it — and started north.</w:t>
       </w:r>
     </w:p>
     <w:p>
@@ -6923,7 +6935,7 @@
           <w:rFonts w:ascii="Georgia" w:hAnsi="Georgia"/>
           <w:sz w:val="24"/>
         </w:rPr>
-        <w:t>Sereth stepped to the side of the road. Bent their back. Rounded their shoulders. Became, in every detail, an old woman making room for authority.</w:t>
+        <w:t>Sereth stepped to the side of the road. Bent her back. Rounded her shoulders. Became, in every detail, an old woman making room for authority.</w:t>
       </w:r>
     </w:p>
     <w:p>
@@ -6947,7 +6959,7 @@
           <w:rFonts w:ascii="Georgia" w:hAnsi="Georgia"/>
           <w:sz w:val="24"/>
         </w:rPr>
-        <w:t>"The mill at Redwater, sir. Three days south." The voice came out exactly right — cracked, deferential, the vowels flattened by a lifetime of Canopy dialect. Sereth had been doing this for centuries. They could produce any voice, any accent, any register of deference or defiance that the moment required. It was not lying. It was acting. The distinction mattered to them, though they could not have explained why.</w:t>
+        <w:t>"The mill at Redwater, sir. Three days south." The voice came out exactly right — cracked, deferential, the vowels flattened by a lifetime of Canopy dialect. Sereth had been doing this for centuries. She could produce any voice, any accent, any register of deference or defiance that the moment required. It was not lying. It was acting. The distinction mattered to her, though she could not have explained why.</w:t>
       </w:r>
     </w:p>
     <w:p>
@@ -7019,19 +7031,19 @@
           <w:rFonts w:ascii="Georgia" w:hAnsi="Georgia"/>
           <w:sz w:val="24"/>
         </w:rPr>
-        <w:t>Sereth had been doing this for decades. Small misdirections. Quiet interventions. A rumor planted here, a false trail laid there. They had never touched Fletcher's bloodline directly — never spoken to the boy, never revealed themselves to the man who guarded him, never intervened in any way that could be traced back to a source. They had operated the way water operates on stone: slowly, invisibly, reshaping the landscape one drop at a time.</w:t>
-      </w:r>
-    </w:p>
-    <w:p>
-      <w:pPr>
-        <w:ind w:firstLine="720"/>
-      </w:pPr>
-      <w:r>
-        <w:rPr>
-          <w:rFonts w:ascii="Georgia" w:hAnsi="Georgia"/>
-          <w:sz w:val="24"/>
-        </w:rPr>
-        <w:t xml:space="preserve">It was penance. That was the word they used, though they were not certain they believed in it. Three hundred years ago, they had given humanity the Song, and humanity had used it to build an empire of theft. Every drained prisoner in Varas's Chamber, every corrupted Knower Ceremony, every child tested and taken and emptied — all of it traced back to a night by a fire when a god leaned close to a kind man and said, </w:t>
+        <w:t>Sereth had been doing this for decades. Small misdirections. Quiet interventions. A rumor planted here, a false trail laid there. She had never touched Fletcher's bloodline directly — never spoken to the boy, never revealed herself to the man who guarded him, never intervened in any way that could be traced back to a source. She had operated the way water operates on stone: slowly, invisibly, reshaping the landscape one drop at a time.</w:t>
+      </w:r>
+    </w:p>
+    <w:p>
+      <w:pPr>
+        <w:ind w:firstLine="720"/>
+      </w:pPr>
+      <w:r>
+        <w:rPr>
+          <w:rFonts w:ascii="Georgia" w:hAnsi="Georgia"/>
+          <w:sz w:val="24"/>
+        </w:rPr>
+        <w:t xml:space="preserve">It was penance. That was the word she used, though she was not certain she believed in it. Three hundred years ago, she had given humanity the Song, and humanity had used it to build an empire of theft. Every drained prisoner in Varas's Chamber, every corrupted Knower Ceremony, every child tested and taken and emptied — all of it traced back to a night by a fire when a god leaned close to a kind man and said, </w:t>
       </w:r>
       <w:r>
         <w:rPr>
@@ -7063,7 +7075,7 @@
           <w:rFonts w:ascii="Georgia" w:hAnsi="Georgia"/>
           <w:sz w:val="24"/>
         </w:rPr>
-        <w:t>Sereth carried this. Every morning, every apple, every face they wore and discarded — the guilt was beneath it all, structural, as permanent as the Song itself. They could not undo what they had done. They could not un-teach the magic or un-speak the words or un-open the door they had opened in Fletcher's mind. They could only do what they had been doing for three centuries: protect the last thread of the bloodline, wait for the Sing to surface again, and hope — a frail, mortal, undivinething — that this time the story would end differently.</w:t>
+        <w:t>Sereth carried this. Every morning, every apple, every face she wore and discarded — the guilt was beneath it all, structural, as permanent as the Song itself. She could not undo what she had done. She could not un-teach the magic or un-speak the words or un-open the door she had opened in Fletcher's mind. She could only do what she had been doing for three centuries: protect the last thread of the bloodline, wait for the Sing to surface again, and hope — a frail, mortal, undivinething — that this time the story would end differently.</w:t>
       </w:r>
     </w:p>
     <w:p>
@@ -7089,31 +7101,31 @@
           <w:rFonts w:ascii="Georgia" w:hAnsi="Georgia"/>
           <w:sz w:val="24"/>
         </w:rPr>
-        <w:t>The forest deepened. The trade road narrowed to a path, the path to a track, the track to a suggestion. Sereth moved through the Canopy with the ease of someone who had walked these woods when the oldest trees were saplings — not fast, not dramatically, but with the unhurried certainty of a person who knows where every root is because they remember where every root was planted.</w:t>
-      </w:r>
-    </w:p>
-    <w:p>
-      <w:pPr>
-        <w:ind w:firstLine="720"/>
-      </w:pPr>
-      <w:r>
-        <w:rPr>
-          <w:rFonts w:ascii="Georgia" w:hAnsi="Georgia"/>
-          <w:sz w:val="24"/>
-        </w:rPr>
-        <w:t>They thought of Essa.</w:t>
-      </w:r>
-    </w:p>
-    <w:p>
-      <w:pPr>
-        <w:ind w:firstLine="720"/>
-      </w:pPr>
-      <w:r>
-        <w:rPr>
-          <w:rFonts w:ascii="Georgia" w:hAnsi="Georgia"/>
-          <w:sz w:val="24"/>
-        </w:rPr>
-        <w:t>They always thought of Essa. It was the tax they paid for mortal memory — the inability to choose what to remember and what to release. A god could curate their past, selecting which memories to keep and which to dissolve back into the divine substrate. A mortal carried everything. Every face. Every loss. Every hand that had held theirs and then let go or been taken or simply stopped existing because mortal hands do that, they stop, and the stopping is the cruelest part of the entire arrangement.</w:t>
+        <w:t>The forest deepened. The trade road narrowed to a path, the path to a track, the track to a suggestion. Sereth moved through the Canopy with the ease of someone who had walked these woods when the oldest trees were saplings — not fast, not dramatically, but with the unhurried certainty of a person who knows where every root is because she remembers where every root was planted.</w:t>
+      </w:r>
+    </w:p>
+    <w:p>
+      <w:pPr>
+        <w:ind w:firstLine="720"/>
+      </w:pPr>
+      <w:r>
+        <w:rPr>
+          <w:rFonts w:ascii="Georgia" w:hAnsi="Georgia"/>
+          <w:sz w:val="24"/>
+        </w:rPr>
+        <w:t>She thought of Essa.</w:t>
+      </w:r>
+    </w:p>
+    <w:p>
+      <w:pPr>
+        <w:ind w:firstLine="720"/>
+      </w:pPr>
+      <w:r>
+        <w:rPr>
+          <w:rFonts w:ascii="Georgia" w:hAnsi="Georgia"/>
+          <w:sz w:val="24"/>
+        </w:rPr>
+        <w:t>She always thought of Essa. It was the tax she paid for mortal memory — the inability to choose what to remember and what to release. A god could curate her past, selecting which memories to keep and which to dissolve back into the divine substrate. A mortal carried everything. Every face. Every loss. Every hand that had held hers and then let go or been taken or simply stopped existing because mortal hands do that, they stop, and the stopping is the cruelest part of the entire arrangement.</w:t>
       </w:r>
     </w:p>
     <w:p>
@@ -7160,7 +7172,7 @@
           <w:rFonts w:ascii="Georgia" w:hAnsi="Georgia"/>
           <w:sz w:val="24"/>
         </w:rPr>
-        <w:t>She had died. Of course she had died. She was mortal. Eighty-one years — the blink of a divine eye, the lifetime of a human heart. Sereth had not been there. They had been elsewhere, wearing a different face, protecting a different generation of Fletcher's blood. They had felt her go — a disturbance in the Guide-spectrum, a silence where a voice had been — and they had sat down wherever they were and wept with a body that was still learning how to produce tears.</w:t>
+        <w:t>She had died. Of course she had died. She was mortal. Eighty-one years — the blink of a divine eye, the lifetime of a human heart. Sereth had not been there. She had been elsewhere, wearing a different face, protecting a different generation of Fletcher's blood. She had felt her go — a disturbance in the Guide-spectrum, a silence where a voice had been — and she had sat down wherever she was and wept with a body that was still learning how to produce tears.</w:t>
       </w:r>
     </w:p>
     <w:p>
@@ -7199,31 +7211,31 @@
           <w:rFonts w:ascii="Georgia" w:hAnsi="Georgia"/>
           <w:sz w:val="24"/>
         </w:rPr>
-        <w:t>Sereth wiped their face. The tears were real. Mortality had not diminished their capacity for grief; it had concentrated it, the way a lens concentrates light. Divine grief was vast and diffuse, a weather system. Mortal grief was a point of fire.</w:t>
-      </w:r>
-    </w:p>
-    <w:p>
-      <w:pPr>
-        <w:ind w:firstLine="720"/>
-      </w:pPr>
-      <w:r>
-        <w:rPr>
-          <w:rFonts w:ascii="Georgia" w:hAnsi="Georgia"/>
-          <w:sz w:val="24"/>
-        </w:rPr>
-        <w:t>They walked on. The Canopy grew denser. The whispers of the trees — which Sereth could still hear, faintly, the last remnant of their divine perception — grew louder, more urgent. The forest knew something had changed. The stone had sung. The Song was in the world again. And somewhere ahead, in a hollow tree or a hidden cave, an old soldier with a ruined face was trying to explain to a fifteen-year-old boy why his entire life had been a lie.</w:t>
-      </w:r>
-    </w:p>
-    <w:p>
-      <w:pPr>
-        <w:ind w:firstLine="720"/>
-      </w:pPr>
-      <w:r>
-        <w:rPr>
-          <w:rFonts w:ascii="Georgia" w:hAnsi="Georgia"/>
-          <w:sz w:val="24"/>
-        </w:rPr>
-        <w:t>Sereth had watched Halvar Eld for fifteen years. Had never spoken to him. Had marveled at his endurance — the daily discipline of suppression, the nightly discipline of grief, the impossible task of raising a child who was born to sing in a world where singing would get him killed. They had wanted to help. They had not helped. They had maintained distance, because distance was the only strategy that had kept the bloodline alive, and because Sereth knew — from three hundred years of watching humans — that their help had a tendency to make things worse.</w:t>
+        <w:t>Sereth wiped her face. The tears were real. Mortality had not diminished her capacity for grief; it had concentrated it, the way a lens concentrates light. Divine grief was vast and diffuse, a weather system. Mortal grief was a point of fire.</w:t>
+      </w:r>
+    </w:p>
+    <w:p>
+      <w:pPr>
+        <w:ind w:firstLine="720"/>
+      </w:pPr>
+      <w:r>
+        <w:rPr>
+          <w:rFonts w:ascii="Georgia" w:hAnsi="Georgia"/>
+          <w:sz w:val="24"/>
+        </w:rPr>
+        <w:t>She walked on. The Canopy grew denser. The whispers of the trees — which Sereth could still hear, faintly, the last remnant of her divine perception — grew louder, more urgent. The forest knew something had changed. The stone had sung. The Song was in the world again. And somewhere ahead, in a hollow tree or a hidden cave, an old soldier with a ruined face was trying to explain to a fifteen-year-old boy why his entire life had been a lie.</w:t>
+      </w:r>
+    </w:p>
+    <w:p>
+      <w:pPr>
+        <w:ind w:firstLine="720"/>
+      </w:pPr>
+      <w:r>
+        <w:rPr>
+          <w:rFonts w:ascii="Georgia" w:hAnsi="Georgia"/>
+          <w:sz w:val="24"/>
+        </w:rPr>
+        <w:t>Sereth had watched Halvar Eld for fifteen years. Had never spoken to him. Had marveled at his endurance — the daily discipline of suppression, the nightly discipline of grief, the impossible task of raising a child who was born to sing in a world where singing would get him killed. She had wanted to help. She had not helped. She had maintained distance, because distance was the only strategy that had kept the bloodline alive, and because Sereth knew — from three hundred years of watching humans — that her help had a tendency to make things worse.</w:t>
       </w:r>
     </w:p>
     <w:p>
@@ -7247,31 +7259,31 @@
           <w:rFonts w:ascii="Georgia" w:hAnsi="Georgia"/>
           <w:sz w:val="24"/>
         </w:rPr>
-        <w:t>They could feel the boy now — a disturbance in the Song-spectrum, a brightness that had no business being this bright this soon. The herbs were gone or failing. The suppression was lifting. And what was emerging was not the tentative, controlled awakening that Sereth had hoped for — years of careful training, gradual exposure, each discipline introduced in sequence — but something raw and total and dangerous. A flood, not a stream. The boy was hearing everything at once, and he had no training, no framework, no understanding of what the sound was or how to survive it.</w:t>
-      </w:r>
-    </w:p>
-    <w:p>
-      <w:pPr>
-        <w:ind w:firstLine="720"/>
-      </w:pPr>
-      <w:r>
-        <w:rPr>
-          <w:rFonts w:ascii="Georgia" w:hAnsi="Georgia"/>
-          <w:sz w:val="24"/>
-        </w:rPr>
-        <w:t>Sereth walked faster. Their knees complained. Their back complained. Their mortal body, with its mortal limitations and its mortal insistence on reminding them that they were not what they used to be, complained at every step.</w:t>
-      </w:r>
-    </w:p>
-    <w:p>
-      <w:pPr>
-        <w:ind w:firstLine="720"/>
-      </w:pPr>
-      <w:r>
-        <w:rPr>
-          <w:rFonts w:ascii="Georgia" w:hAnsi="Georgia"/>
-          <w:sz w:val="24"/>
-        </w:rPr>
-        <w:t>They ignored it. They had been ignoring it for three hundred years. A few more miles would not matter.</w:t>
+        <w:t>She could feel the boy now — a disturbance in the Song-spectrum, a brightness that had no business being this bright this soon. The herbs were gone or failing. The suppression was lifting. And what was emerging was not the tentative, controlled awakening that Sereth had hoped for — years of careful training, gradual exposure, each discipline introduced in sequence — but something raw and total and dangerous. A flood, not a stream. The boy was hearing everything at once, and he had no training, no framework, no understanding of what the sound was or how to survive it.</w:t>
+      </w:r>
+    </w:p>
+    <w:p>
+      <w:pPr>
+        <w:ind w:firstLine="720"/>
+      </w:pPr>
+      <w:r>
+        <w:rPr>
+          <w:rFonts w:ascii="Georgia" w:hAnsi="Georgia"/>
+          <w:sz w:val="24"/>
+        </w:rPr>
+        <w:t>Sereth walked faster. Her knees complained. Her back complained. Her mortal body, with its mortal limitations and its mortal insistence on reminding her that she was not what she used to be, complained at every step.</w:t>
+      </w:r>
+    </w:p>
+    <w:p>
+      <w:pPr>
+        <w:ind w:firstLine="720"/>
+      </w:pPr>
+      <w:r>
+        <w:rPr>
+          <w:rFonts w:ascii="Georgia" w:hAnsi="Georgia"/>
+          <w:sz w:val="24"/>
+        </w:rPr>
+        <w:t>She ignored it. She had been ignoring it for three hundred years. A few more miles would not matter.</w:t>
       </w:r>
     </w:p>
     <w:p>
@@ -7295,7 +7307,7 @@
           <w:rFonts w:ascii="Georgia" w:hAnsi="Georgia"/>
           <w:sz w:val="24"/>
         </w:rPr>
-        <w:t>Sereth stopped at the edge of the clearing. They did not enter. Not yet. They stood in the shadows and watched the light pulse — the rhythm of Halvar Eld's breathing, translated into amber, the heartbeat of a man who had been a wall between the fire and the Song for fifteen years and whose wall was finally, mercifully, no longer needed.</w:t>
+        <w:t>Sereth stopped at the edge of the clearing. She did not enter. Not yet. She stood in the shadows and watched the light pulse — the rhythm of Halvar Eld's breathing, translated into amber, the heartbeat of a man who had been a wall between the fire and the Song for fifteen years and whose wall was finally, mercifully, no longer needed.</w:t>
       </w:r>
     </w:p>
     <w:p>
@@ -7335,7 +7347,7 @@
           <w:rFonts w:ascii="Georgia" w:hAnsi="Georgia"/>
           <w:sz w:val="24"/>
         </w:rPr>
-        <w:t>They stepped out of the trees.</w:t>
+        <w:t>She stepped out of the trees.</w:t>
       </w:r>
     </w:p>
     <w:p>
@@ -9615,7 +9627,7 @@
           <w:rFonts w:ascii="Georgia" w:hAnsi="Georgia"/>
           <w:sz w:val="24"/>
         </w:rPr>
-        <w:t>Aelo looked up. Sereth sat on a rock at the edge of the clearing, legs crossed, hands resting on knees, watching him with the patient expression of someone observing a process they had seen before — not this exact process, not this boy, but something in the same family. A distant cousin of this pain.</w:t>
+        <w:t>Aelo looked up. Sereth sat on a rock at the edge of the clearing, legs crossed, hands resting on knees, watching him with the patient expression of someone observing a process she had seen before — not this exact process, not this boy, but something in the same family. A distant cousin of this pain.</w:t>
       </w:r>
     </w:p>
     <w:p>
@@ -9639,7 +9651,7 @@
           <w:rFonts w:ascii="Georgia" w:hAnsi="Georgia"/>
           <w:sz w:val="24"/>
         </w:rPr>
-        <w:t>"It was necessary. The compression had to release. You just released it." Sereth tilted their head. "Loudly. But that's the nature of things that have been held for too long."</w:t>
+        <w:t>"It was necessary. The compression had to release. You just released it." Sereth tilted her head. "Loudly. But that's the nature of things that have been held for too long."</w:t>
       </w:r>
     </w:p>
     <w:p>
@@ -10068,7 +10080,7 @@
           <w:rFonts w:ascii="Georgia" w:hAnsi="Georgia"/>
           <w:sz w:val="24"/>
         </w:rPr>
-        <w:t>The birds returned to the branches. The insects resumed their frequencies. The elm settled back into its roots with a sound like a long exhale. Sereth, on their rock, watched the boy with an expression that three hundred years of mortality had not dulled — the expression of someone watching a thing they had broken begin, at last, to repair itself.</w:t>
+        <w:t>The birds returned to the branches. The insects resumed their frequencies. The elm settled back into its roots with a sound like a long exhale. Sereth, on her rock, watched the boy with an expression that three hundred years of mortality had not dulled — the expression of someone watching a thing she had broken begin, at last, to repair itself.</w:t>
       </w:r>
     </w:p>
     <w:p>
@@ -11108,7 +11120,7 @@
           <w:rFonts w:ascii="Georgia" w:hAnsi="Georgia"/>
           <w:sz w:val="24"/>
         </w:rPr>
-        <w:t>Sereth walked ahead. They moved through the forest with the unhurried ease of someone who knew where every root was — not from skill but from memory, the way you know the floorboards of the house you grew up in, which ones creak and which ones hold. Occasionally they paused, placed a hand on a trunk, and stood still for a moment, their face doing something Aelo could not read. Then they moved on.</w:t>
+        <w:t>Sereth walked ahead. She moved through the forest with the unhurried ease of someone who knew where every root was — not from skill but from memory, the way you know the floorboards of the house you grew up in, which ones creak and which ones hold. Occasionally she paused, placed a hand on a trunk, and stood still for a moment, her face doing something Aelo could not read. Then she moved on.</w:t>
       </w:r>
     </w:p>
     <w:p>
@@ -11225,7 +11237,7 @@
           <w:rFonts w:ascii="Georgia" w:hAnsi="Georgia"/>
           <w:sz w:val="24"/>
         </w:rPr>
-        <w:t>Sereth's voice, from ahead. They had stopped walking and were looking at Aelo with the expression that Aelo was beginning to recognize as their default — patient, measured, carrying the weight of something they had not yet decided to explain.</w:t>
+        <w:t>Sereth's voice, from ahead. She had stopped walking and was looking at Aelo with the expression that Aelo was beginning to recognize as her default — patient, measured, carrying the weight of something she had not yet decided to explain.</w:t>
       </w:r>
     </w:p>
     <w:p>
@@ -11249,7 +11261,7 @@
           <w:rFonts w:ascii="Georgia" w:hAnsi="Georgia"/>
           <w:sz w:val="24"/>
         </w:rPr>
-        <w:t>"I can feel the trees responding. They're leaning toward you." Sereth gestured. Aelo looked. The old woman was right — the nearest trunks had tilted, minutely, imperceptibly to anyone who wasn't looking for it, their canopies shifting to angle more of their leaves in his direction. As if he were a light source and they were orienting toward him. "You're not just listening. You're pulling. Your attention has weight."</w:t>
+        <w:t>"I can feel the trees responding. They're leaning toward you." Sereth gestured. Aelo looked. She was right — the nearest trunks had tilted, minutely, imperceptibly to anyone who wasn't looking for it, their canopies shifting to angle more of their leaves in his direction. As if he were a light source and they were orienting toward him. "You're not just listening. You're pulling. Your attention has weight."</w:t>
       </w:r>
     </w:p>
     <w:p>
@@ -11273,7 +11285,7 @@
           <w:rFonts w:ascii="Georgia" w:hAnsi="Georgia"/>
           <w:sz w:val="24"/>
         </w:rPr>
-        <w:t xml:space="preserve">"I know. That's the danger." Sereth walked back to him. Up close, their eyes were wrong for the face they wore — too deep, too layered, the iris flecked with a darkness that was not color but </w:t>
+        <w:t xml:space="preserve">"I know. That's the danger." Sereth walked back to him. Up close, her eyes were wrong for the face she wore — too deep, too layered, the iris flecked with a darkness that was not color but </w:t>
       </w:r>
       <w:r>
         <w:rPr>
@@ -11288,7 +11300,7 @@
           <w:rFonts w:ascii="Georgia" w:hAnsi="Georgia"/>
           <w:sz w:val="24"/>
         </w:rPr>
-        <w:t>, like looking down into water that goes further than it should. "The Know is the first discipline. The ability to hear the world's memory. Every child born with magical sensitivity begins here — they hear before they speak, feel before they act. But the Know is passive. It's the ear, not the voice. And your ear is..." They paused, choosing words. "Very large."</w:t>
+        <w:t>, like looking down into water that goes further than it should. "The Know is the first discipline. The ability to hear the world's memory. Every child born with magical sensitivity begins here — they hear before they speak, feel before they act. But the Know is passive. It's the ear, not the voice. And your ear is..." She paused, choosing words. "Very large."</w:t>
       </w:r>
     </w:p>
     <w:p>
@@ -11348,7 +11360,7 @@
           <w:rFonts w:ascii="Georgia" w:hAnsi="Georgia"/>
           <w:sz w:val="24"/>
         </w:rPr>
-        <w:t>"The Sing is not a discipline. It's the harmonization of all seven. Know, Mold, Heal, Move, Guide, Burn — each one a single voice. The Sing is what happens when all seven voices sound at once, in a single throat. Fletcher could do it. Your mother came close. It has not been done fully since Fletcher dissolved into the Great Elder Stone three hundred years ago." Sereth's face was very still. "She could hold five disciplines simultaneously. On the night she died, she held six. The seventh — the one she couldn't reach — would have saved her."</w:t>
+        <w:t>"The Sing is not a discipline. It's the harmonization of all seven. Know, Mold, Heal, Move, Guide, Burn — each one a single voice. The Sing is what happens when all seven voices sound at once, in a single throat. Fletcher could do it. Your mother came close. It has not been done fully since Fletcher dissolved into the Great Elder Stone three hundred years ago." Sereth's face was very still. "Your mother could hold five disciplines simultaneously. On the night she died, she held six. The seventh — the one she couldn't reach — would have saved her."</w:t>
       </w:r>
     </w:p>
     <w:p>
@@ -11408,7 +11420,7 @@
           <w:rFonts w:ascii="Georgia" w:hAnsi="Georgia"/>
           <w:sz w:val="24"/>
         </w:rPr>
-        <w:t>"Burn?" Sereth looked at him. The depth in their eyes was not coldness — Aelo could feel it now, could taste the specific quality of Sereth's attention: salt and age and the grief of someone who has watched this question asked before. "I don't know. I don't know what your limits are. I don't know which of the seven you'll reach and which will resist you. That's what we're going to find out."</w:t>
+        <w:t>"Burn?" Sereth looked at him. The depth in her eyes was not coldness — Aelo could feel it now, could taste the specific quality of Sereth's attention: salt and age and the grief of someone who has watched this question asked before. "I don't know. I don't know what your limits are. I don't know which of the seven you'll reach and which will resist you. That's what we're going to find out."</w:t>
       </w:r>
     </w:p>
     <w:p>
@@ -11863,7 +11875,7 @@
           <w:rFonts w:ascii="Georgia" w:hAnsi="Georgia"/>
           <w:sz w:val="24"/>
         </w:rPr>
-        <w:t>"Essa's granddaughter. The last Guide worth the name." Sereth's voice carried something when they said it — the salt-grief, the water-memory, but also something new. Something that tasted like a held breath approaching its release. "She'll teach you to ask."</w:t>
+        <w:t>"Essa's granddaughter. The last Guide worth the name." Sereth's voice carried something when she said it — the salt-grief, the water-memory, but also something new. Something that tasted like a held breath approaching its release. "She'll teach you to ask."</w:t>
       </w:r>
     </w:p>
     <w:p>

</xml_diff>